<commit_message>
Relatable example: SYN-107/109 without remarks (AI must infer or ask), Demo 2 as a program-office data call with audit close, approved-systems line
Co-Authored-By: Claude Opus 5.5 <noreply@anthropic.com>
Claude-Session: https://claude.ai/code/session_01P4wyHvWAGZBDCUAjTzmt7H
</commit_message>
<xml_diff>
--- a/copilot-kit/fy26_q3_execution_report.docx
+++ b/copilot-kit/fy26_q3_execution_report.docx
@@ -1804,7 +1804,7 @@
                 <w:sz w:val="14"/>
                 <w:szCs w:val="14"/>
               </w:rPr>
-              <w:t xml:space="preserve">One-time purchase of 1,150 replacement workstations (end of life), approved by resource board 2 Jun; unit cost below expense/investment threshold.</w:t>
+              <w:t xml:space="preserve"/>
             </w:r>
           </w:p>
         </w:tc>
@@ -2234,7 +2234,7 @@
                 <w:sz w:val="14"/>
                 <w:szCs w:val="14"/>
               </w:rPr>
-              <w:t xml:space="preserve">Task order obligated on schedule; contractor invoices for Apr–Jun not yet received.</w:t>
+              <w:t xml:space="preserve"/>
             </w:r>
           </w:p>
         </w:tc>

</xml_diff>